<commit_message>
Update manuscript and online appendix
Replace Manuscript/Manuscript_Brexit_elasticity.docx and Manuscript/Online_appendix.docx with updated versions. Also remove the temporary Office backup file Manuscript/~$line_appendix.docx that was left in the repo.
</commit_message>
<xml_diff>
--- a/Manuscript/Online_appendix.docx
+++ b/Manuscript/Online_appendix.docx
@@ -55,7 +55,16 @@
           <w:rFonts w:ascii="Times New Roman" w:eastAsia="Times New Roman" w:hAnsi="Times New Roman" w:cs="Times New Roman"/>
           <w:lang w:eastAsia="en-GB"/>
         </w:rPr>
-        <w:t>To validate that treated EU origin markets are compared against structurally similar unaffected markets, we implement a trajectory-based nearest-neighbor matching procedure grounded exclusively in pre-Brexit application dynamics. For each country c, we construct a vector of pre-period applications:</w:t>
+        <w:t>To validate that treated EU origin markets are compar</w:t>
+      </w:r>
+      <w:bookmarkStart w:id="0" w:name="_GoBack"/>
+      <w:bookmarkEnd w:id="0"/>
+      <w:r>
+        <w:rPr>
+          <w:rFonts w:ascii="Times New Roman" w:eastAsia="Times New Roman" w:hAnsi="Times New Roman" w:cs="Times New Roman"/>
+          <w:lang w:eastAsia="en-GB"/>
+        </w:rPr>
+        <w:t>ed against structurally similar unaffected markets, we implement a trajectory-based nearest-neighbor matching procedure grounded exclusively in pre-Brexit application dynamics. For each country c, we construct a vector of pre-period applications:</w:t>
       </w:r>
     </w:p>
     <w:p>
@@ -3982,16 +3991,6 @@
     </w:tbl>
     <w:p>
       <w:pPr>
-        <w:spacing w:before="100" w:beforeAutospacing="1" w:after="100" w:afterAutospacing="1" w:line="360" w:lineRule="auto"/>
-        <w:jc w:val="both"/>
-        <w:rPr>
-          <w:rFonts w:ascii="Times New Roman" w:eastAsia="Times New Roman" w:hAnsi="Times New Roman" w:cs="Times New Roman"/>
-          <w:lang w:eastAsia="en-GB"/>
-        </w:rPr>
-      </w:pPr>
-    </w:p>
-    <w:p>
-      <w:pPr>
         <w:spacing w:line="360" w:lineRule="auto"/>
         <w:jc w:val="both"/>
         <w:rPr>
@@ -4110,12 +4109,6 @@
           <w:rFonts w:ascii="Times New Roman" w:hAnsi="Times New Roman" w:cs="Times New Roman"/>
         </w:rPr>
         <w:br/>
-      </w:r>
-      <w:r>
-        <w:rPr>
-          <w:rFonts w:ascii="Times New Roman" w:hAnsi="Times New Roman" w:cs="Times New Roman"/>
-        </w:rPr>
-        <w:lastRenderedPageBreak/>
         <w:t xml:space="preserve">[5] Imai, K., &amp; Kim, I. S. (2020). When should we use unit fixed effects regression models for causal inference with longitudinal data? </w:t>
       </w:r>
       <w:r>
@@ -4148,6 +4141,7 @@
           <w:sz w:val="28"/>
           <w:szCs w:val="28"/>
         </w:rPr>
+        <w:lastRenderedPageBreak/>
         <w:t xml:space="preserve">From the Bresnahan conduct model to the </w:t>
       </w:r>
       <w:proofErr w:type="spellStart"/>
@@ -5038,32 +5032,7 @@
           <w:rFonts w:ascii="Times New Roman" w:eastAsia="Times New Roman" w:hAnsi="Times New Roman" w:cs="Times New Roman"/>
           <w:lang w:eastAsia="en-GB"/>
         </w:rPr>
-        <w:t>are additio</w:t>
-      </w:r>
-      <w:proofErr w:type="spellStart"/>
-      <w:r>
-        <w:rPr>
-          <w:rFonts w:ascii="Times New Roman" w:eastAsia="Times New Roman" w:hAnsi="Times New Roman" w:cs="Times New Roman"/>
-          <w:lang w:eastAsia="en-GB"/>
-        </w:rPr>
-        <w:t>nal</w:t>
-      </w:r>
-      <w:proofErr w:type="spellEnd"/>
-      <w:r>
-        <w:rPr>
-          <w:rFonts w:ascii="Times New Roman" w:eastAsia="Times New Roman" w:hAnsi="Times New Roman" w:cs="Times New Roman"/>
-          <w:lang w:eastAsia="en-GB"/>
-        </w:rPr>
-        <w:t xml:space="preserve"> o</w:t>
-      </w:r>
-      <w:bookmarkStart w:id="0" w:name="_GoBack"/>
-      <w:bookmarkEnd w:id="0"/>
-      <w:r>
-        <w:rPr>
-          <w:rFonts w:ascii="Times New Roman" w:eastAsia="Times New Roman" w:hAnsi="Times New Roman" w:cs="Times New Roman"/>
-          <w:lang w:eastAsia="en-GB"/>
-        </w:rPr>
-        <w:t>bservables,</w:t>
+        <w:t>are additional observables,</w:t>
       </w:r>
     </w:p>
     <w:p>
@@ -7751,15 +7720,7 @@
         </m:sSub>
       </m:oMath>
       <w:r>
-        <w:t xml:space="preserve"> and the log pri</w:t>
-      </w:r>
-      <w:proofErr w:type="spellStart"/>
-      <w:r>
-        <w:t>ce</w:t>
-      </w:r>
-      <w:proofErr w:type="spellEnd"/>
-      <w:r>
-        <w:t xml:space="preserve"> shock </w:t>
+        <w:t xml:space="preserve"> and the log price shock </w:t>
       </w:r>
       <m:oMath>
         <m:sSub>
@@ -18813,21 +18774,7 @@
         <w:rPr>
           <w:rFonts w:ascii="Times New Roman" w:hAnsi="Times New Roman" w:cs="Times New Roman"/>
         </w:rPr>
-        <w:t>) therefore corresponds to the economically relevant demand elasticity because the exponent</w:t>
-      </w:r>
-      <w:proofErr w:type="spellStart"/>
-      <w:r>
-        <w:rPr>
-          <w:rFonts w:ascii="Times New Roman" w:hAnsi="Times New Roman" w:cs="Times New Roman"/>
-        </w:rPr>
-        <w:t>ial</w:t>
-      </w:r>
-      <w:proofErr w:type="spellEnd"/>
-      <w:r>
-        <w:rPr>
-          <w:rFonts w:ascii="Times New Roman" w:hAnsi="Times New Roman" w:cs="Times New Roman"/>
-        </w:rPr>
-        <w:t xml:space="preserve"> function is convex, the average slope across a large interval must be flatter than the tangent at the starting point. </w:t>
+        <w:t xml:space="preserve">) therefore corresponds to the economically relevant demand elasticity because the exponential function is convex, the average slope across a large interval must be flatter than the tangent at the starting point. </w:t>
       </w:r>
       <w:r>
         <w:rPr>
@@ -39068,47 +39015,7 @@
           <w:lang w:eastAsia="en-GB"/>
           <w14:ligatures w14:val="none"/>
         </w:rPr>
-        <w:t>Clifton-</w:t>
-      </w:r>
-      <w:proofErr w:type="spellStart"/>
-      <w:r>
-        <w:rPr>
-          <w:rFonts w:ascii="Times New Roman" w:eastAsia="Times New Roman" w:hAnsi="Times New Roman" w:cs="Times New Roman"/>
-          <w:kern w:val="0"/>
-          <w:lang w:eastAsia="en-GB"/>
-          <w14:ligatures w14:val="none"/>
-        </w:rPr>
-        <w:t>Sprigg</w:t>
-      </w:r>
-      <w:proofErr w:type="spellEnd"/>
-      <w:r>
-        <w:rPr>
-          <w:rFonts w:ascii="Times New Roman" w:eastAsia="Times New Roman" w:hAnsi="Times New Roman" w:cs="Times New Roman"/>
-          <w:kern w:val="0"/>
-          <w:lang w:eastAsia="en-GB"/>
-          <w14:ligatures w14:val="none"/>
-        </w:rPr>
-        <w:t xml:space="preserve"> et al. (2025) primarily due to sample composition and annual coverage (our samples covers the years up to 2024, while Clifton-</w:t>
-      </w:r>
-      <w:proofErr w:type="spellStart"/>
-      <w:r>
-        <w:rPr>
-          <w:rFonts w:ascii="Times New Roman" w:eastAsia="Times New Roman" w:hAnsi="Times New Roman" w:cs="Times New Roman"/>
-          <w:kern w:val="0"/>
-          <w:lang w:eastAsia="en-GB"/>
-          <w14:ligatures w14:val="none"/>
-        </w:rPr>
-        <w:t>Sprigg</w:t>
-      </w:r>
-      <w:proofErr w:type="spellEnd"/>
-      <w:r>
-        <w:rPr>
-          <w:rFonts w:ascii="Times New Roman" w:eastAsia="Times New Roman" w:hAnsi="Times New Roman" w:cs="Times New Roman"/>
-          <w:kern w:val="0"/>
-          <w:lang w:eastAsia="en-GB"/>
-          <w14:ligatures w14:val="none"/>
-        </w:rPr>
-        <w:t xml:space="preserve"> et al. (2025) only up to 2022, and we restricted the period from 2015 to 2024, while they use the full span from 2006 to 2024).</w:t>
+        <w:t>Clifton-Sprigg et al. (2025) primarily due to sample composition and annual coverage (our samples covers the years up to 2024, while Clifton-Sprigg et al. (2025) only up to 2022, and we restricted the period from 2015 to 2024, while they use the full span from 2006 to 2024).</w:t>
       </w:r>
       <w:r>
         <w:rPr>

</xml_diff>